<commit_message>
Corregge la dedica di J'accuse: alle donne afghane
Co-Authored-By: Claude Opus 5.5 <noreply@anthropic.com>
Claude-Session: https://claude.ai/code/session_0148bZgqQiCtdshijf84M1Qp
</commit_message>
<xml_diff>
--- a/testi-critici/artisti/eb-art/word/opera-j-accuse.docx
+++ b/testi-critici/artisti/eb-art/word/opera-j-accuse.docx
@@ -63,7 +63,7 @@
           <w:color w:val="1E1B18"/>
           <w:sz w:val="21"/>
         </w:rPr>
-        <w:t>Del volto restano soltanto gli occhi, e guardano dritto chi passa. Linee nere stringono la figura come una rete, intorno il blu è notte. Il titolo è quello di Zola: un atto d’accusa, per le donne a cui un regime ha tolto il volto ma non lo sguardo.</w:t>
+        <w:t>Del volto restano soltanto gli occhi, e guardano dritto chi passa. Linee nere stringono la figura come una rete, intorno il blu è notte. Il titolo è quello di Zola: un atto d’accusa, per le donne afghane, a cui i talebani hanno tolto il volto ma non lo sguardo.</w:t>
       </w:r>
     </w:p>
     <w:p>
@@ -79,7 +79,7 @@
           <w:color w:val="6B645B"/>
           <w:sz w:val="18"/>
         </w:rPr>
-        <w:t>Only the eyes remain of the face, and they look straight at whoever passes. Black lines tighten around the figure like a net; around it, the blue is night. The title is Zola’s: an act of accusation, for the women from whom a regime has taken the face but not the gaze.</w:t>
+        <w:t>Only the eyes remain of the face, and they look straight at whoever passes. Black lines tighten around the figure like a net; around it, the blue is night. The title is Zola’s: an act of accusation, for the women of Afghanistan, from whom the Taliban have taken the face but not the gaze.</w:t>
       </w:r>
     </w:p>
     <w:sectPr>

</xml_diff>

<commit_message>
Riscrive la didascalia di J'accuse: è la donna ad accusare chi guarda
Co-Authored-By: Claude Opus 5.5 <noreply@anthropic.com>
Claude-Session: https://claude.ai/code/session_0148bZgqQiCtdshijf84M1Qp
</commit_message>
<xml_diff>
--- a/testi-critici/artisti/eb-art/word/opera-j-accuse.docx
+++ b/testi-critici/artisti/eb-art/word/opera-j-accuse.docx
@@ -63,7 +63,7 @@
           <w:color w:val="1E1B18"/>
           <w:sz w:val="21"/>
         </w:rPr>
-        <w:t>Del volto restano soltanto gli occhi, e guardano dritto chi passa. Linee nere stringono la figura come una rete, intorno il blu è notte. Il titolo è quello di Zola: un atto d’accusa, per le donne afghane, a cui i talebani hanno tolto il volto ma non lo sguardo.</w:t>
+        <w:t>Del volto restano soltanto gli occhi, e guardano dritto chi passa. Linee nere stringono la figura come una rete, intorno il blu è notte. Il titolo è quello di Zola, ma l’accusa è sua: una donna afghana che il regime fa scomparire punta lo sguardo su di noi, sul mondo che guarda e lascia fare.</w:t>
       </w:r>
     </w:p>
     <w:p>
@@ -79,7 +79,7 @@
           <w:color w:val="6B645B"/>
           <w:sz w:val="18"/>
         </w:rPr>
-        <w:t>Only the eyes remain of the face, and they look straight at whoever passes. Black lines tighten around the figure like a net; around it, the blue is night. The title is Zola’s: an act of accusation, for the women of Afghanistan, from whom the Taliban have taken the face but not the gaze.</w:t>
+        <w:t>Only the eyes remain of the face, and they look straight at whoever passes. Black lines tighten around the figure like a net; around it, the blue is night. The title is Zola’s, but the accusation is hers: an Afghan woman whom the regime is making disappear fixes her gaze on us, on the world that watches and lets it happen.</w:t>
       </w:r>
     </w:p>
     <w:sectPr>

</xml_diff>